<commit_message>
v2.16 (John's word, 2 October): PROAPT, the why behind each step (S7-8). Slide 10's speaker notes gain a WHY line, one reason per step, with the deck and the Leader Notes handout in step and the slide face unchanged; new one-page leader page "PROAPT — What Each Step Is For" (md record in leader-pages/; Word + PDF in Planning) on the order: data before interpretation, what the text says before what it means; changelog v2.16
Co-Authored-By: Claude Opus 5.5 <noreply@anthropic.com>
</commit_message>
<xml_diff>
--- a/_implementation-notes/evening-series/FotH Evening Session 7-8 Combined Leader Notes DRAFT v1.docx
+++ b/_implementation-notes/evening-series/FotH Evening Session 7-8 Combined Leader Notes DRAFT v1.docx
@@ -664,6 +664,21 @@
     </w:p>
     <w:p>
       <w:pPr>
+        <w:ind w:left="216"/>
+      </w:pPr>
+      <w:r>
+        <w:rPr>
+          <w:b/>
+          <w:color w:val="595959"/>
+        </w:rPr>
+        <w:t>WHY:</w:t>
+      </w:r>
+      <w:r>
+        <w:t xml:space="preserve"> the order protects the hearing — what the text says before what it means. 1. PRAY — we come to hear, not to extract; the Word is His. 2. READ — let it land whole before taking it apart. 3. OBSERVE, the data — the ground: what the page actually says, checkable by anyone; skipping it is where most misreadings start. OBSERVE, the interpretation — what it meant in its own world before it means anything in ours. 4. APPLY — where reading becomes hearing: one specific thing, for me, not for someone else. 5. PRAY AGAIN — hearing becomes a response; obedience starts here. 6. TELL — spoken hearing stays, and someone else hears what you heard. Full page: “PROAPT — What Each Step Is For” (Planning).</w:t>
+      </w:r>
+    </w:p>
+    <w:p>
+      <w:pPr>
         <w:keepNext/>
         <w:spacing w:before="160" w:after="20"/>
       </w:pPr>

</xml_diff>

<commit_message>
v2.26 (John's review, 8 October): Sessions 7-8 — pairs always (small-room circle option and parent-pairing bullet removed), one timekeeper with time targets (switch 8:02, Tell 8:13, back 8:19), the Pair Card (P12 on paper), day boxes on the daily-PROAPT homework (sheet still one page; P16 re-rendered), blessings spoken to the person not read off the screen (P18); sync tool files Pair/Breakout Cards
Co-Authored-By: Claude Opus 5.5 <noreply@anthropic.com>
</commit_message>
<xml_diff>
--- a/_implementation-notes/evening-series/FotH Evening Session 7-8 Combined Leader Notes DRAFT v1.docx
+++ b/_implementation-notes/evening-series/FotH Evening Session 7-8 Combined Leader Notes DRAFT v1.docx
@@ -644,7 +644,7 @@
         <w:t xml:space="preserve">CUES: </w:t>
       </w:r>
       <w:r>
-        <w:t>Passage cards for both passages at each seat; the journal Week 7 pages carry the daily template.</w:t>
+        <w:t>Passage cards for both passages at each seat; the Pair Card printed, one per pair and a spare; the journal Week 7 pages carry the daily template.</w:t>
       </w:r>
     </w:p>
     <w:p>
@@ -1394,7 +1394,7 @@
         <w:t xml:space="preserve">BEATS: </w:t>
       </w:r>
       <w:r>
-        <w:t>1. Explain the pair shape: parent with your own teen by default; one Reader, one Listener; switch at twelve minutes. 2. Name it: pairing inside your own family is the design working, not the consolation prize. 3. Pray and send.</w:t>
+        <w:t>1. Explain the pair shape: parent with your own teen by default; one Reader, one Listener; switch at twelve minutes. 2. Name one timekeeper before anyone moves — the container holder by default, or anyone the leaders pick — who calls the switch at 8:02, the Tell at 8:13, and back in the circle at 8:19. 3. Hand each pair a Pair Card. 4. Pray and send.</w:t>
       </w:r>
     </w:p>
     <w:p>
@@ -1412,7 +1412,7 @@
         <w:t xml:space="preserve">CUES: </w:t>
       </w:r>
       <w:r>
-        <w:t>Lead Companions settle odd numbers across families. If the room is about ten or fewer, skip the pairing — one circle, pair up in place.</w:t>
+        <w:t>Lead Companions settle odd numbers across families. Pairs always, even in a small room: the practice is one Reader and one Listener, and a circle cannot give that.</w:t>
       </w:r>
     </w:p>
     <w:p>
@@ -1500,6 +1500,17 @@
         <w:spacing w:before="0" w:after="60"/>
       </w:pPr>
       <w:r>
+        <w:t>TIME TARGETS (the timekeeper calls them): pass one 7:50–8:02; switch at 8:02; pass two 8:02–8:13; the Tell, still in the pair, 8:13–8:19; back in the circle at 8:19 for the merge. If the room is running late, keep the two passes equal and shorten both rather than drop the second.</w:t>
+      </w:r>
+    </w:p>
+    <w:p>
+      <w:pPr>
+        <w:pBdr>
+          <w:left w:val="double" w:sz="12" w:space="8" w:color="B45309"/>
+        </w:pBdr>
+        <w:spacing w:before="0" w:after="60"/>
+      </w:pPr>
+      <w:r>
         <w:rPr>
           <w:b/>
           <w:color w:val="595959"/>
@@ -1508,6 +1519,24 @@
       </w:r>
       <w:r>
         <w:t>1. First pass 12 min: Reader leads the six steps, Listener works alongside without interrupting; Reader's Tell goes to the Listener, one sentence. 2. Switch roles; second pass 12 min, same or new passage. 3. Companions float: stuck on Observe — 'one word or phrase that caught you'; stuck on Apply — 'one specific situation right now'; rushing — 'the Spirit isn't in a hurry'; finished early — another passage, get reps.</w:t>
+      </w:r>
+    </w:p>
+    <w:p>
+      <w:pPr>
+        <w:pBdr>
+          <w:left w:val="double" w:sz="12" w:space="8" w:color="B45309"/>
+        </w:pBdr>
+        <w:spacing w:before="0" w:after="60"/>
+      </w:pPr>
+      <w:r>
+        <w:rPr>
+          <w:b/>
+          <w:color w:val="595959"/>
+        </w:rPr>
+        <w:t xml:space="preserve">PRINT: </w:t>
+      </w:r>
+      <w:r>
+        <w:t>the Pair Card (Leader Notes folder) carries this slide, the six steps, the passages, the times and the stuck-prompts, so each pair has it in hand away from the screen.</w:t>
       </w:r>
     </w:p>
     <w:p>
@@ -2240,7 +2269,7 @@
         <w:t xml:space="preserve">BEATS: </w:t>
       </w:r>
       <w:r>
-        <w:t>1. Bridge the weeks: last week we named hard places, today we practiced hearing — both are real, both are how the Father walks us home; the place named last week is the place PROAPT will keep speaking into. 2. Aaronic blessing, hands up. 3. Send: 'PROAPT one passage tomorrow. See you evenings.'</w:t>
+        <w:t>1. Bridge the weeks: last week we named hard places, today we practiced hearing — both are real, both are how the Father walks us home; the place named last week is the place PROAPT will keep speaking into. 2. Blessings: turn away from the screen and face the person. Nothing to read — say what is in front of you for this person, specific and short. Then the Aaronic blessing, hands up. 3. Send: 'PROAPT one passage tomorrow. See you evenings.'</w:t>
       </w:r>
     </w:p>
     <w:p>

</xml_diff>

<commit_message>
v2.29 (John's planning lab, 11 October): Sessions 7-8 — fresh passages for pass one on the Pair Card; take-home: own journal with the handout as template, choose a paragraph, don't skip the Tell, the preparation sentence filled; the container holder keeps the clock (no separate timekeeper); planning lab rehearses delivery; Sessions 9-10 on Monday 26 October
Co-Authored-By: Claude Opus 5.5 <noreply@anthropic.com>
</commit_message>
<xml_diff>
--- a/_implementation-notes/evening-series/FotH Evening Session 7-8 Combined Leader Notes DRAFT v1.docx
+++ b/_implementation-notes/evening-series/FotH Evening Session 7-8 Combined Leader Notes DRAFT v1.docx
@@ -1394,7 +1394,7 @@
         <w:t xml:space="preserve">BEATS: </w:t>
       </w:r>
       <w:r>
-        <w:t>1. Explain the pair shape: parent with your own teen by default; one Reader, one Listener; switch at twelve minutes. 2. Name one timekeeper before anyone moves — the container holder by default, or anyone the leaders pick — who calls the switch at 8:02, the Tell at 8:13, and back in the circle at 8:19. 3. Hand each pair a Pair Card. 4. Pray and send.</w:t>
+        <w:t>1. Explain the pair shape: parent with your own teen by default; one Reader, one Listener; switch at twelve minutes. 2. The container holder keeps the clock and calls the switch at 8:02, the Tell at 8:13, and back in the circle at 8:19. 3. Hand each pair a Pair Card. 4. Pray and send.</w:t>
       </w:r>
     </w:p>
     <w:p>
@@ -1500,7 +1500,7 @@
         <w:spacing w:before="0" w:after="60"/>
       </w:pPr>
       <w:r>
-        <w:t>TIME TARGETS (the timekeeper calls them): pass one 7:50–8:02; switch at 8:02; pass two 8:02–8:13; the Tell, still in the pair, 8:13–8:19; back in the circle at 8:19 for the merge. If the room is running late, keep the two passes equal and shorten both rather than drop the second.</w:t>
+        <w:t>TIME TARGETS (the container holder calls them): pass one 7:50–8:02; switch at 8:02; pass two 8:02–8:13; the Tell, still in the pair, 8:13–8:19; back in the circle at 8:19 for the merge. If the room is running late, keep the two passes equal and shorten both rather than drop the second.</w:t>
       </w:r>
     </w:p>
     <w:p>
@@ -1518,7 +1518,7 @@
         <w:t xml:space="preserve">BEATS: </w:t>
       </w:r>
       <w:r>
-        <w:t>1. First pass 12 min: Reader leads the six steps, Listener works alongside without interrupting; Reader's Tell goes to the Listener, one sentence. 2. Switch roles; second pass 12 min, same or new passage. 3. Companions float: stuck on Observe — 'one word or phrase that caught you'; stuck on Apply — 'one specific situation right now'; rushing — 'the Spirit isn't in a hurry'; finished early — another passage, get reps.</w:t>
+        <w:t>1. First pass 12 min: Reader leads the six steps, Listener works alongside without interrupting; Reader's Tell goes to the Listener, one sentence. 2. Switch roles; second pass 12 min, same or new passage. For pass one, pairs may take a fresh passage instead of Mark 1:14–20 again: Luke 5:1–11, John 1:35–42, or Mark 10:46–52 (on the Pair Card). 3. Companions float: stuck on Observe — 'one word or phrase that caught you'; stuck on Apply — 'one specific situation right now'; rushing — 'the Spirit isn't in a hurry'; finished early — another passage, get reps.</w:t>
       </w:r>
     </w:p>
     <w:p>
@@ -2034,7 +2034,7 @@
         <w:spacing w:before="0" w:after="60"/>
       </w:pPr>
       <w:r>
-        <w:t>1. The four parts, in order: the homework practice, week one; the end-of-week-one check-in; the homework practice, week two; one sentence of preparation.</w:t>
+        <w:t>1. The four parts, in order: the homework practice, week one; the end-of-week-one check-in; the homework practice, week two; one sentence of preparation. Name the two new lines: choose a paragraph (one central thought), and don't skip the Tell.</w:t>
       </w:r>
     </w:p>
     <w:p>

</xml_diff>

<commit_message>
v2.34: journal lines in Evenings 4 and 6 point to your own journal (John's word); changelog
Co-Authored-By: Claude Opus 5.5 <noreply@anthropic.com>
</commit_message>
<xml_diff>
--- a/_implementation-notes/evening-series/FotH Evening Session 7-8 Combined Leader Notes DRAFT v1.docx
+++ b/_implementation-notes/evening-series/FotH Evening Session 7-8 Combined Leader Notes DRAFT v1.docx
@@ -644,7 +644,7 @@
         <w:t xml:space="preserve">CUES: </w:t>
       </w:r>
       <w:r>
-        <w:t>Passage cards for both passages at each seat; the Pair Card printed, one per pair and a spare; the journal Week 7 pages carry the daily template.</w:t>
+        <w:t>Passage cards for both passages at each seat; the Pair Card printed, one per pair and a spare; your own journal, with the PROAPT page of the take-home as the daily template.</w:t>
       </w:r>
     </w:p>
     <w:p>
@@ -1772,7 +1772,7 @@
         <w:t xml:space="preserve">BEATS: </w:t>
       </w:r>
       <w:r>
-        <w:t>1. One word each — not what you heard (that is yours), but what the practice was like. 2. Introduce daily PROAPT: one short passage, five to ten minutes, every day — the journal Week 7 pages have the template. 3. Hold up H7.3: passage paths for teens and parents. 4. 'The chain only works if we work it.'</w:t>
+        <w:t>1. One word each — not what you heard (that is yours), but what the practice was like. 2. Introduce daily PROAPT: one short passage, five to ten minutes, every day — your own journal, with the PROAPT page of the take-home as the template. 3. Hold up H7.3: passage paths for teens and parents. 4. 'The chain only works if we work it.'</w:t>
       </w:r>
     </w:p>
     <w:p>

</xml_diff>